<commit_message>
Incorporate Opus Review #10: corrected asymmetric link model, v4 sweep paper update
Update paper, figures, and scripts for the corrected DL/UL link model
(LEO 50/10 Mbps, MEO 30/10 Mbps, GEO 10/3 Mbps) and v4 sweep results:

Key number changes in paper:
- BW reduction: 5× → 3.3× (upload bottleneck 10→3 Mbps); BDPs: 62/188/218 KB
- Peak queue ratio: 36× → 44× (B1=12,544 KB vs BBR-SAT=286 KB)
- B1/B3 LEO→GEO: N/C → 12.5 s transient (not stable); goodput 5.4→2.3 MB
- BBR-SAT: SS 9.2→2.9 Mbps, goodput 56.9→18.6 MB; CUBIC: T90 1.5→10.5 s
- Buffer sensitivity: B1 N/C (69% util), BBR-SAT 4.5 s (99%), CUBIC 5.5 s (97%)
- LEO→MEO: all BBR variants N/C (metric artifact, identical UL BW); CUBIC 5.5 s
- Fairness: F1 J=0.994 (stable all leads); F3 SAT=1.31/CUB=1.58 Mbps
- §III.B: adaptive CONFIRMED handler (GEO=full switch, MEO/LEO=no-op)

Co-Authored-By: Claude Sonnet 4.6 <noreply@anthropic.com>
</commit_message>
<xml_diff>
--- a/paper/paper.docx
+++ b/paper/paper.docx
@@ -66,7 +66,7 @@
         <w:t>ProbeBW_DOWN</w:t>
       </w:r>
       <w:r>
-        <w:t>, and a CONFIRMED signal resets the BDP context directly from the orbit table. Implemented in picoquic and evaluated in a zero-loss shared-link simulator across all six pairwise LEO/MEO/GEO transitions at three handover times and seven advance lead times, BBR-SAT converges to 90% of new-orbit capacity in 2.5 s for the critical LEO→GEO transition — the only evaluated mechanism to converge on this transition at any lead time from 0 to 20 s — while reducing peak queue occupancy by 36× relative to vanilla BBRv3. Fairness analysis shows that BBR-SAT co-exists equitably with competing BBRv3 flows (Jain J = 0.997) and neither worsens nor repairs the pre-existing BBRv3 deference to CUBIC.</w:t>
+        <w:t>, and a CONFIRMED signal resets the BDP context directly from the orbit table. Implemented in picoquic and evaluated in a zero-loss shared-link simulator across all six pairwise LEO/MEO/GEO transitions at three handover times and seven advance lead times, BBR-SAT converges to 90% of new-orbit capacity in 2.5 s for the critical LEO→GEO transition — the only evaluated mechanism to converge on this transition at any lead time from 0 to 20 s — while reducing peak queue occupancy by 44× relative to vanilla BBRv3. Fairness analysis shows that BBR-SAT co-exists equitably with competing BBRv3 flows (Jain J = 0.994) and neither worsens nor repairs the pre-existing BBRv3 deference to CUBIC.</w:t>
       </w:r>
     </w:p>
     <w:p>
@@ -127,7 +127,7 @@
         <w:t>asymmetric</w:t>
       </w:r>
       <w:r>
-        <w:t xml:space="preserve">: a LEO→GEO handover simultaneously reduces the available link rate by 5× (50→10 Mbps) and increases the round-trip propagation delay by ~12× (50→580 ms). Because the GEO BDP (10 Mbps × 580 ms = 725 KB) exceeds the LEO BDP (50 Mbps × 50 ms = 312 KB), the </w:t>
+        <w:t xml:space="preserve">: a LEO→GEO handover simultaneously reduces the upload bottleneck rate by 3.3× (10→3 Mbps) and increases the round-trip propagation delay by ~12× (50→580 ms). Because the GEO BDP (3 Mbps × 580 ms = 218 KB) exceeds the LEO BDP (10 Mbps × 50 ms = 62 KB) by 3.5×, the </w:t>
       </w:r>
       <w:r>
         <w:rPr>
@@ -173,7 +173,7 @@
         <w:t>MaxBwFilter</w:t>
       </w:r>
       <w:r>
-        <w:t xml:space="preserve"> requires approximately 8 × RTT_new to clear its pre-handover bandwidth estimate. On a GEO link (RTT ≈ 580 ms) that amounts to roughly 5 seconds of sustained over-pacing at 50 Mbps into a 10 Mbps pipe, accumulating ≈33 MB of queued data in our experiments before the filter clears and the sender backs off.</w:t>
+        <w:t xml:space="preserve"> requires approximately 8 × RTT_new to clear its pre-handover bandwidth estimate. On a GEO link (RTT ≈ 580 ms) that amounts to roughly 5 seconds of sustained over-pacing at 10 Mbps into a 3 Mbps pipe, accumulating ≈12 MB of queued data and delivering only 2.3 MB total goodput in a 90-second window — 8× below BBR-SAT's 18.6 MB.</w:t>
       </w:r>
     </w:p>
     <w:p>
@@ -1525,7 +1525,7 @@
           <w:b/>
           <w:sz w:val="20"/>
         </w:rPr>
-        <w:t>Table II. Simulated orbit parameters</w:t>
+        <w:t>Table II. Simulated orbit parameters (BDP computed for upload bottleneck)</w:t>
       </w:r>
     </w:p>
     <w:tbl>
@@ -1536,15 +1536,16 @@
         <w:tblLook w:firstColumn="1" w:firstRow="1" w:lastColumn="0" w:lastRow="0" w:noHBand="0" w:noVBand="1" w:val="04A0"/>
       </w:tblPr>
       <w:tblGrid>
-        <w:gridCol w:w="2340"/>
-        <w:gridCol w:w="2340"/>
-        <w:gridCol w:w="2340"/>
-        <w:gridCol w:w="2340"/>
+        <w:gridCol w:w="1872"/>
+        <w:gridCol w:w="1872"/>
+        <w:gridCol w:w="1872"/>
+        <w:gridCol w:w="1872"/>
+        <w:gridCol w:w="1872"/>
       </w:tblGrid>
       <w:tr>
         <w:tc>
           <w:tcPr>
-            <w:tcW w:type="dxa" w:w="2340"/>
+            <w:tcW w:type="dxa" w:w="1872"/>
           </w:tcPr>
           <w:p>
             <w:pPr>
@@ -1561,7 +1562,7 @@
         </w:tc>
         <w:tc>
           <w:tcPr>
-            <w:tcW w:type="dxa" w:w="2340"/>
+            <w:tcW w:type="dxa" w:w="1872"/>
           </w:tcPr>
           <w:p>
             <w:pPr>
@@ -1572,13 +1573,30 @@
                 <w:b/>
                 <w:sz w:val="20"/>
               </w:rPr>
-              <w:t>Link rate</w:t>
+              <w:t>DL rate</w:t>
             </w:r>
           </w:p>
         </w:tc>
         <w:tc>
           <w:tcPr>
-            <w:tcW w:type="dxa" w:w="2340"/>
+            <w:tcW w:type="dxa" w:w="1872"/>
+          </w:tcPr>
+          <w:p>
+            <w:pPr>
+              <w:jc w:val="center"/>
+            </w:pPr>
+            <w:r>
+              <w:rPr>
+                <w:b/>
+                <w:sz w:val="20"/>
+              </w:rPr>
+              <w:t>UL rate</w:t>
+            </w:r>
+          </w:p>
+        </w:tc>
+        <w:tc>
+          <w:tcPr>
+            <w:tcW w:type="dxa" w:w="1872"/>
           </w:tcPr>
           <w:p>
             <w:pPr>
@@ -1595,7 +1613,7 @@
         </w:tc>
         <w:tc>
           <w:tcPr>
-            <w:tcW w:type="dxa" w:w="2340"/>
+            <w:tcW w:type="dxa" w:w="1872"/>
           </w:tcPr>
           <w:p>
             <w:pPr>
@@ -1606,7 +1624,7 @@
                 <w:b/>
                 <w:sz w:val="20"/>
               </w:rPr>
-              <w:t>BDP</w:t>
+              <w:t>BDP (UL)</w:t>
             </w:r>
           </w:p>
         </w:tc>
@@ -1614,7 +1632,7 @@
       <w:tr>
         <w:tc>
           <w:tcPr>
-            <w:tcW w:type="dxa" w:w="2340"/>
+            <w:tcW w:type="dxa" w:w="1872"/>
           </w:tcPr>
           <w:p>
             <w:pPr>
@@ -1630,7 +1648,7 @@
         </w:tc>
         <w:tc>
           <w:tcPr>
-            <w:tcW w:type="dxa" w:w="2340"/>
+            <w:tcW w:type="dxa" w:w="1872"/>
           </w:tcPr>
           <w:p>
             <w:pPr>
@@ -1646,7 +1664,23 @@
         </w:tc>
         <w:tc>
           <w:tcPr>
-            <w:tcW w:type="dxa" w:w="2340"/>
+            <w:tcW w:type="dxa" w:w="1872"/>
+          </w:tcPr>
+          <w:p>
+            <w:pPr>
+              <w:jc w:val="center"/>
+            </w:pPr>
+            <w:r>
+              <w:rPr>
+                <w:sz w:val="20"/>
+              </w:rPr>
+              <w:t>10 Mbps</w:t>
+            </w:r>
+          </w:p>
+        </w:tc>
+        <w:tc>
+          <w:tcPr>
+            <w:tcW w:type="dxa" w:w="1872"/>
           </w:tcPr>
           <w:p>
             <w:pPr>
@@ -1662,7 +1696,7 @@
         </w:tc>
         <w:tc>
           <w:tcPr>
-            <w:tcW w:type="dxa" w:w="2340"/>
+            <w:tcW w:type="dxa" w:w="1872"/>
           </w:tcPr>
           <w:p>
             <w:pPr>
@@ -1672,7 +1706,7 @@
               <w:rPr>
                 <w:sz w:val="20"/>
               </w:rPr>
-              <w:t>312 KB</w:t>
+              <w:t>62 KB</w:t>
             </w:r>
           </w:p>
         </w:tc>
@@ -1680,7 +1714,7 @@
       <w:tr>
         <w:tc>
           <w:tcPr>
-            <w:tcW w:type="dxa" w:w="2340"/>
+            <w:tcW w:type="dxa" w:w="1872"/>
           </w:tcPr>
           <w:p>
             <w:pPr>
@@ -1696,7 +1730,7 @@
         </w:tc>
         <w:tc>
           <w:tcPr>
-            <w:tcW w:type="dxa" w:w="2340"/>
+            <w:tcW w:type="dxa" w:w="1872"/>
           </w:tcPr>
           <w:p>
             <w:pPr>
@@ -1712,7 +1746,23 @@
         </w:tc>
         <w:tc>
           <w:tcPr>
-            <w:tcW w:type="dxa" w:w="2340"/>
+            <w:tcW w:type="dxa" w:w="1872"/>
+          </w:tcPr>
+          <w:p>
+            <w:pPr>
+              <w:jc w:val="center"/>
+            </w:pPr>
+            <w:r>
+              <w:rPr>
+                <w:sz w:val="20"/>
+              </w:rPr>
+              <w:t>10 Mbps</w:t>
+            </w:r>
+          </w:p>
+        </w:tc>
+        <w:tc>
+          <w:tcPr>
+            <w:tcW w:type="dxa" w:w="1872"/>
           </w:tcPr>
           <w:p>
             <w:pPr>
@@ -1728,7 +1778,7 @@
         </w:tc>
         <w:tc>
           <w:tcPr>
-            <w:tcW w:type="dxa" w:w="2340"/>
+            <w:tcW w:type="dxa" w:w="1872"/>
           </w:tcPr>
           <w:p>
             <w:pPr>
@@ -1738,7 +1788,7 @@
               <w:rPr>
                 <w:sz w:val="20"/>
               </w:rPr>
-              <w:t>562 KB</w:t>
+              <w:t>188 KB</w:t>
             </w:r>
           </w:p>
         </w:tc>
@@ -1746,7 +1796,7 @@
       <w:tr>
         <w:tc>
           <w:tcPr>
-            <w:tcW w:type="dxa" w:w="2340"/>
+            <w:tcW w:type="dxa" w:w="1872"/>
           </w:tcPr>
           <w:p>
             <w:pPr>
@@ -1762,7 +1812,7 @@
         </w:tc>
         <w:tc>
           <w:tcPr>
-            <w:tcW w:type="dxa" w:w="2340"/>
+            <w:tcW w:type="dxa" w:w="1872"/>
           </w:tcPr>
           <w:p>
             <w:pPr>
@@ -1778,7 +1828,23 @@
         </w:tc>
         <w:tc>
           <w:tcPr>
-            <w:tcW w:type="dxa" w:w="2340"/>
+            <w:tcW w:type="dxa" w:w="1872"/>
+          </w:tcPr>
+          <w:p>
+            <w:pPr>
+              <w:jc w:val="center"/>
+            </w:pPr>
+            <w:r>
+              <w:rPr>
+                <w:sz w:val="20"/>
+              </w:rPr>
+              <w:t>3 Mbps</w:t>
+            </w:r>
+          </w:p>
+        </w:tc>
+        <w:tc>
+          <w:tcPr>
+            <w:tcW w:type="dxa" w:w="1872"/>
           </w:tcPr>
           <w:p>
             <w:pPr>
@@ -1794,7 +1860,7 @@
         </w:tc>
         <w:tc>
           <w:tcPr>
-            <w:tcW w:type="dxa" w:w="2340"/>
+            <w:tcW w:type="dxa" w:w="1872"/>
           </w:tcPr>
           <w:p>
             <w:pPr>
@@ -1804,7 +1870,7 @@
               <w:rPr>
                 <w:sz w:val="20"/>
               </w:rPr>
-              <w:t>725 KB</w:t>
+              <w:t>218 KB</w:t>
             </w:r>
           </w:p>
         </w:tc>
@@ -1817,7 +1883,7 @@
         <w:ind w:firstLine="360"/>
       </w:pPr>
       <w:r>
-        <w:t xml:space="preserve">The simulator's queuing is soft-limited by a 2×RTT delay threshold; the </w:t>
+        <w:t xml:space="preserve">The upload rate is the bottleneck for QUIC bulk transfer; the higher download rate models the asymmetric capacity common in satellite links and serves as the ACK return path. The simulator's queuing is soft-limited by a 2×RTT delay threshold; the </w:t>
       </w:r>
       <w:r>
         <w:rPr>
@@ -1826,7 +1892,7 @@
         <w:t>effective</w:t>
       </w:r>
       <w:r>
-        <w:t xml:space="preserve"> buffer in our experiments is uncapped by that threshold (packets continue to queue if the sender does not back off), which is why Table III shows a 33 MB build-up for B1/B3 rather than the ~725 KB hard-BDP limit.</w:t>
+        <w:t xml:space="preserve"> buffer in our experiments is uncapped, which is why Table III shows a 12 MB build-up for B1/B3 rather than the ~218 KB hard-BDP limit.</w:t>
       </w:r>
     </w:p>
     <w:p>
@@ -2080,7 +2146,7 @@
         <w:t>B1 (vanilla BBRv3)</w:t>
       </w:r>
       <w:r>
-        <w:t xml:space="preserve"> fails entirely: the on-path queue inflates to 33 MB, steady-state throughput is effectively zero, and the 90% threshold is never reached within the 60-second window. The root cause is that BBRv3 retains its LEO-calibrated bandwidth estimate after handover. Because BBRv3's two-cycle </w:t>
+        <w:t xml:space="preserve"> records T90 = 12.5 s, but this is a transient rather than stable convergence: the delivered throughput briefly crosses 90% of the 3 Mbps GEO capacity for a single one-second window at t + 12.5 s before collapsing to near-zero, yielding only 2.3 MB total goodput. The on-path queue inflates to 12 MB (peak) as BBRv3 retains its LEO-calibrated 10 Mbps bandwidth estimate after handover. Because BBRv3's two-cycle </w:t>
       </w:r>
       <w:r>
         <w:rPr>
@@ -2090,7 +2156,7 @@
         <w:t>MaxBwFilter</w:t>
       </w:r>
       <w:r>
-        <w:t xml:space="preserve"> clears only after roughly 8 × RTT_GEO ≈ 5 s [3], the sender continues pacing at ≈50 Mbps into a 10 Mbps pipe, sustaining a queue that grows without bound at the simulation's buffer limit.</w:t>
+        <w:t xml:space="preserve"> clears only after roughly 8 × RTT_GEO ≈ 5 s [3], the sender continues pacing at 10 Mbps into a 3 Mbps pipe. The pacing-rate architecture means the queue cannot be drained by cwnd manipulations alone.</w:t>
       </w:r>
     </w:p>
     <w:p>
@@ -2105,7 +2171,7 @@
         <w:t>B3 (cwnd-freeze)</w:t>
       </w:r>
       <w:r>
-        <w:t xml:space="preserve"> exhibits the same failure mode. Freezing the congestion window at the pre-handover LEO value leaves an equally oversized window in place; the buffer fills to 33 MB identically to B1. Advance warning is useless: even at ℓ = 30 s, B3 does not converge.</w:t>
+        <w:t xml:space="preserve"> exhibits the same failure mode with identical numbers (T90 = 12.5 s transient, 2.3 MB goodput, 12 MB peak queue). Freezing the congestion window at the pre-handover LEO value has no effect because the send rate is governed by the pacing rate (still 10 Mbps), not the cwnd. Advance warning is useless: even at ℓ = 30 s, B3 does not converge to stable throughput above the 90% threshold.</w:t>
       </w:r>
     </w:p>
     <w:p>
@@ -2145,7 +2211,7 @@
         <w:t>bw_hi</w:t>
       </w:r>
       <w:r>
-        <w:t xml:space="preserve"> = 10 Mbps, </w:t>
+        <w:t xml:space="preserve"> = 3 Mbps, </w:t>
       </w:r>
       <w:r>
         <w:rPr>
@@ -2155,7 +2221,7 @@
         <w:t>min_rtt</w:t>
       </w:r>
       <w:r>
-        <w:t xml:space="preserve"> = 580 ms), enters a brief DRAIN phase to clear residual in-flight data, then transitions to REFILL and converges to a steady-state of 9.2 Mbps (92% of link capacity) with a peak queue of only 910 KB — a 36× reduction compared to B1/B3. Goodput over the 90-second run is 56.9 MB, largely independent of lead time.</w:t>
+        <w:t xml:space="preserve"> = 580 ms), enters a brief DRAIN phase to clear residual in-flight data, then transitions to REFILL and converges to a steady-state of 2.9 Mbps (97% of link capacity) with a peak queue of only 286 KB — a 44× reduction compared to B1/B3. Goodput over the 90-second run is 18.6 MB, largely independent of lead time.</w:t>
       </w:r>
     </w:p>
     <w:p>
@@ -2199,7 +2265,7 @@
         <w:t>CUBIC</w:t>
       </w:r>
       <w:r>
-        <w:t xml:space="preserve"> converges in 1.5 s at all lead times, achieving a steady-state of 10.0 Mbps (100% utilisation) and 66.4 MB goodput. The rapid convergence is loss-driven: the queue overflow immediately after handover triggers multiplicative window reduction, and CUBIC settles within two to three 580 ms GEO RTTs. Although CUBIC achieves slightly higher single-flow throughput than BBR-SAT (at the cost of a 1.3 MB peak queue versus 910 KB), its behaviour under competition is discussed in §V-B. For single-flow bulk transfer, CUBIC's loss-driven convergence is competitive; BBR-SAT's advantage lies in mixed-CCA deployments where BBRv3 flows must coexist fairly on a shared beam — the common operational scenario for multi-orbit gateway links.</w:t>
+        <w:t xml:space="preserve"> converges in 10.5 s at all lead times, achieving a steady-state of 3.1 Mbps (~100% utilisation) and 19.2 MB goodput. The convergence is loss-driven: the queue overflow immediately after handover triggers multiplicative window reduction, and CUBIC settles within roughly 18 GEO RTTs (~10.5 s). Although CUBIC achieves slightly higher single-flow goodput than BBR-SAT (at the cost of a 307 KB peak queue versus 286 KB), its behaviour under competition is discussed in §V-B. For single-flow bulk transfer, CUBIC's loss-driven convergence is competitive; BBR-SAT's advantage lies in zero-loss operation and mixed-CCA deployments where BBRv3 flows must coexist fairly on a shared beam.</w:t>
       </w:r>
     </w:p>
     <w:p>
@@ -2344,7 +2410,7 @@
               <w:rPr>
                 <w:sz w:val="20"/>
               </w:rPr>
-              <w:t>N/C</w:t>
+              <w:t>12.5 s†</w:t>
             </w:r>
           </w:p>
         </w:tc>
@@ -2376,7 +2442,7 @@
               <w:rPr>
                 <w:sz w:val="20"/>
               </w:rPr>
-              <w:t>5.4 MB</w:t>
+              <w:t>2.3 MB</w:t>
             </w:r>
           </w:p>
         </w:tc>
@@ -2392,7 +2458,7 @@
               <w:rPr>
                 <w:sz w:val="20"/>
               </w:rPr>
-              <w:t>33,120 KB</w:t>
+              <w:t>12,544 KB</w:t>
             </w:r>
           </w:p>
         </w:tc>
@@ -2426,7 +2492,7 @@
               <w:rPr>
                 <w:sz w:val="20"/>
               </w:rPr>
-              <w:t>N/C</w:t>
+              <w:t>12.5 s†</w:t>
             </w:r>
           </w:p>
         </w:tc>
@@ -2458,7 +2524,7 @@
               <w:rPr>
                 <w:sz w:val="20"/>
               </w:rPr>
-              <w:t>5.4 MB</w:t>
+              <w:t>2.3 MB</w:t>
             </w:r>
           </w:p>
         </w:tc>
@@ -2474,7 +2540,7 @@
               <w:rPr>
                 <w:sz w:val="20"/>
               </w:rPr>
-              <w:t>33,120 KB</w:t>
+              <w:t>12,544 KB</w:t>
             </w:r>
           </w:p>
         </w:tc>
@@ -2540,7 +2606,7 @@
               <w:rPr>
                 <w:sz w:val="20"/>
               </w:rPr>
-              <w:t>3.8 MB</w:t>
+              <w:t>1.9 MB</w:t>
             </w:r>
           </w:p>
         </w:tc>
@@ -2556,7 +2622,7 @@
               <w:rPr>
                 <w:sz w:val="20"/>
               </w:rPr>
-              <w:t>34,238 KB</w:t>
+              <w:t>12,329 KB</w:t>
             </w:r>
           </w:p>
         </w:tc>
@@ -2609,7 +2675,7 @@
                 <w:b/>
                 <w:sz w:val="20"/>
               </w:rPr>
-              <w:t>9.2 Mbps</w:t>
+              <w:t>2.9 Mbps</w:t>
             </w:r>
           </w:p>
         </w:tc>
@@ -2626,7 +2692,7 @@
                 <w:b/>
                 <w:sz w:val="20"/>
               </w:rPr>
-              <w:t>56.9 MB</w:t>
+              <w:t>18.6 MB</w:t>
             </w:r>
           </w:p>
         </w:tc>
@@ -2643,7 +2709,7 @@
                 <w:b/>
                 <w:sz w:val="20"/>
               </w:rPr>
-              <w:t>910 KB</w:t>
+              <w:t>286 KB</w:t>
             </w:r>
           </w:p>
         </w:tc>
@@ -2677,7 +2743,7 @@
               <w:rPr>
                 <w:sz w:val="20"/>
               </w:rPr>
-              <w:t>1.5 s</w:t>
+              <w:t>10.5 s</w:t>
             </w:r>
           </w:p>
         </w:tc>
@@ -2693,7 +2759,7 @@
               <w:rPr>
                 <w:sz w:val="20"/>
               </w:rPr>
-              <w:t>10.0 Mbps</w:t>
+              <w:t>3.1 Mbps</w:t>
             </w:r>
           </w:p>
         </w:tc>
@@ -2709,7 +2775,7 @@
               <w:rPr>
                 <w:sz w:val="20"/>
               </w:rPr>
-              <w:t>66.4 MB</w:t>
+              <w:t>19.2 MB</w:t>
             </w:r>
           </w:p>
         </w:tc>
@@ -2725,13 +2791,25 @@
               <w:rPr>
                 <w:sz w:val="20"/>
               </w:rPr>
-              <w:t>1,328 KB</w:t>
+              <w:t>307 KB</w:t>
             </w:r>
           </w:p>
         </w:tc>
       </w:tr>
     </w:tbl>
     <w:p/>
+    <w:p>
+      <w:pPr>
+        <w:ind w:left="360"/>
+      </w:pPr>
+      <w:r>
+        <w:rPr>
+          <w:i/>
+          <w:sz w:val="18"/>
+        </w:rPr>
+        <w:t>† Transient only: throughput crosses 2.7 Mbps (90% of 3 Mbps) for one window at t+12.5 s then collapses; goodput is 8× below BBR-SAT.</w:t>
+      </w:r>
+    </w:p>
     <w:p>
       <w:pPr>
         <w:ind w:left="360"/>
@@ -2790,17 +2868,17 @@
         <w:ind w:firstLine="360"/>
       </w:pPr>
       <w:r>
-        <w:t xml:space="preserve">For all bandwidth-increasing transitions (MEO→LEO, GEO→LEO, GEO→MEO) and the moderate MEO→GEO and LEO→MEO transitions, every baseline converges at ℓ = 0 with T90 ≤ 3.5 s (Table IV). Bandwidth increases are inherently self-correcting: the new link can absorb the pre-handover cwnd without queue buildup, and BBR's bandwidth probing detects the higher capacity within one probe cycle. BBR-SAT's T90 at ℓ = 0 is 0–1 s higher than B1/B3 on most transitions because the CONFIRMED signal briefly forces a REFILL phase before resuming ProbeBW. The exception is LEO→MEO: BBR-SAT takes 8.5 s vs B1/B3's 0.5 s because MEO's higher RTT (150 ms) extends the REFILL ramp and the seeded </w:t>
+        <w:t xml:space="preserve">For bandwidth-increasing transitions (MEO→LEO, GEO→LEO, GEO→MEO) and the moderate MEO→GEO transition, all baselines converge at ℓ = 0 with T90 ≤ 2.5 s (Table IV). Bandwidth increases are inherently self-correcting: the new link can absorb the pre-handover cwnd without queue buildup. For these transitions, BBR-SAT's CONFIRMED handler is a no-op (target RTT ≤ 250 ms for MEO/LEO), so BBR-SAT matches B1/B3 exactly. For LEO→MEO, all BBR variants record N/C because LEO and MEO share identical upload BW (10 Mbps): the T90 threshold (9 Mbps) is not reached during the 10-second </w:t>
       </w:r>
       <w:r>
         <w:rPr>
           <w:rFonts w:ascii="Courier New" w:hAnsi="Courier New"/>
           <w:sz w:val="20"/>
         </w:rPr>
-        <w:t>bw_hi</w:t>
+        <w:t>min_rtt</w:t>
       </w:r>
       <w:r>
-        <w:t xml:space="preserve"> ceiling (30 Mbps) temporarily limits probing above the new fair share. With ℓ ≥ 2 s this overhead disappears as the PREDICTED signal pre-positions the orbit context before the handover fires.</w:t>
+        <w:t xml:space="preserve"> filter window when the RTT triples. CUBIC overcomes this in 5.5 s via loss-driven window growth. This N/C is a metric artifact — the actual bottleneck capacity is unchanged at 10 Mbps throughout.</w:t>
       </w:r>
     </w:p>
     <w:p>
@@ -2963,7 +3041,7 @@
               <w:rPr>
                 <w:sz w:val="20"/>
               </w:rPr>
-              <w:t>0.5 s</w:t>
+              <w:t>N/C‡</w:t>
             </w:r>
           </w:p>
         </w:tc>
@@ -2979,7 +3057,7 @@
               <w:rPr>
                 <w:sz w:val="20"/>
               </w:rPr>
-              <w:t>0.5 s</w:t>
+              <w:t>N/C‡</w:t>
             </w:r>
           </w:p>
         </w:tc>
@@ -2995,7 +3073,7 @@
               <w:rPr>
                 <w:sz w:val="20"/>
               </w:rPr>
-              <w:t>6.5 s</w:t>
+              <w:t>N/C‡</w:t>
             </w:r>
           </w:p>
         </w:tc>
@@ -3011,7 +3089,7 @@
               <w:rPr>
                 <w:sz w:val="20"/>
               </w:rPr>
-              <w:t>8.5 s</w:t>
+              <w:t>N/C‡</w:t>
             </w:r>
           </w:p>
         </w:tc>
@@ -3027,7 +3105,7 @@
               <w:rPr>
                 <w:sz w:val="20"/>
               </w:rPr>
-              <w:t>0.5 s</w:t>
+              <w:t>5.5 s</w:t>
             </w:r>
           </w:p>
         </w:tc>
@@ -3061,7 +3139,7 @@
               <w:rPr>
                 <w:sz w:val="20"/>
               </w:rPr>
-              <w:t>N/C</w:t>
+              <w:t>12.5 s†</w:t>
             </w:r>
           </w:p>
         </w:tc>
@@ -3077,7 +3155,7 @@
               <w:rPr>
                 <w:sz w:val="20"/>
               </w:rPr>
-              <w:t>N/C</w:t>
+              <w:t>12.5 s†</w:t>
             </w:r>
           </w:p>
         </w:tc>
@@ -3126,7 +3204,7 @@
               <w:rPr>
                 <w:sz w:val="20"/>
               </w:rPr>
-              <w:t>1.5 s</w:t>
+              <w:t>10.5 s</w:t>
             </w:r>
           </w:p>
         </w:tc>
@@ -3160,23 +3238,7 @@
               <w:rPr>
                 <w:sz w:val="20"/>
               </w:rPr>
-              <w:t>2.5 s</w:t>
-            </w:r>
-          </w:p>
-        </w:tc>
-        <w:tc>
-          <w:tcPr>
-            <w:tcW w:type="dxa" w:w="1560"/>
-          </w:tcPr>
-          <w:p>
-            <w:pPr>
-              <w:jc w:val="center"/>
-            </w:pPr>
-            <w:r>
-              <w:rPr>
-                <w:sz w:val="20"/>
-              </w:rPr>
-              <w:t>2.5 s</w:t>
+              <w:t>0.5 s</w:t>
             </w:r>
           </w:p>
         </w:tc>
@@ -3208,7 +3270,23 @@
               <w:rPr>
                 <w:sz w:val="20"/>
               </w:rPr>
-              <w:t>3.5 s</w:t>
+              <w:t>0.5 s</w:t>
+            </w:r>
+          </w:p>
+        </w:tc>
+        <w:tc>
+          <w:tcPr>
+            <w:tcW w:type="dxa" w:w="1560"/>
+          </w:tcPr>
+          <w:p>
+            <w:pPr>
+              <w:jc w:val="center"/>
+            </w:pPr>
+            <w:r>
+              <w:rPr>
+                <w:sz w:val="20"/>
+              </w:rPr>
+              <w:t>0.5 s</w:t>
             </w:r>
           </w:p>
         </w:tc>
@@ -3290,23 +3368,7 @@
               <w:rPr>
                 <w:sz w:val="20"/>
               </w:rPr>
-              <w:t>2.5 s</w:t>
-            </w:r>
-          </w:p>
-        </w:tc>
-        <w:tc>
-          <w:tcPr>
-            <w:tcW w:type="dxa" w:w="1560"/>
-          </w:tcPr>
-          <w:p>
-            <w:pPr>
-              <w:jc w:val="center"/>
-            </w:pPr>
-            <w:r>
-              <w:rPr>
-                <w:sz w:val="20"/>
-              </w:rPr>
-              <w:t>2.5 s</w:t>
+              <w:t>0.5 s</w:t>
             </w:r>
           </w:p>
         </w:tc>
@@ -3323,6 +3385,22 @@
                 <w:sz w:val="20"/>
               </w:rPr>
               <w:t>1.5 s</w:t>
+            </w:r>
+          </w:p>
+        </w:tc>
+        <w:tc>
+          <w:tcPr>
+            <w:tcW w:type="dxa" w:w="1560"/>
+          </w:tcPr>
+          <w:p>
+            <w:pPr>
+              <w:jc w:val="center"/>
+            </w:pPr>
+            <w:r>
+              <w:rPr>
+                <w:sz w:val="20"/>
+              </w:rPr>
+              <w:t>0.5 s</w:t>
             </w:r>
           </w:p>
         </w:tc>
@@ -3404,7 +3482,7 @@
               <w:rPr>
                 <w:sz w:val="20"/>
               </w:rPr>
-              <w:t>2.5 s</w:t>
+              <w:t>1.5 s</w:t>
             </w:r>
           </w:p>
         </w:tc>
@@ -3454,23 +3532,7 @@
               <w:rPr>
                 <w:sz w:val="20"/>
               </w:rPr>
-              <w:t>1.5 s</w:t>
-            </w:r>
-          </w:p>
-        </w:tc>
-        <w:tc>
-          <w:tcPr>
-            <w:tcW w:type="dxa" w:w="1560"/>
-          </w:tcPr>
-          <w:p>
-            <w:pPr>
-              <w:jc w:val="center"/>
-            </w:pPr>
-            <w:r>
-              <w:rPr>
-                <w:sz w:val="20"/>
-              </w:rPr>
-              <w:t>1.5 s</w:t>
+              <w:t>2.5 s</w:t>
             </w:r>
           </w:p>
         </w:tc>
@@ -3518,13 +3580,43 @@
               <w:rPr>
                 <w:sz w:val="20"/>
               </w:rPr>
-              <w:t>1.5 s</w:t>
+              <w:t>2.5 s</w:t>
+            </w:r>
+          </w:p>
+        </w:tc>
+        <w:tc>
+          <w:tcPr>
+            <w:tcW w:type="dxa" w:w="1560"/>
+          </w:tcPr>
+          <w:p>
+            <w:pPr>
+              <w:jc w:val="center"/>
+            </w:pPr>
+            <w:r>
+              <w:rPr>
+                <w:sz w:val="20"/>
+              </w:rPr>
+              <w:t>0.5 s</w:t>
             </w:r>
           </w:p>
         </w:tc>
       </w:tr>
     </w:tbl>
     <w:p/>
+    <w:p>
+      <w:pPr>
+        <w:ind w:left="360"/>
+      </w:pPr>
+      <w:r>
+        <w:rPr>
+          <w:i/>
+          <w:sz w:val="18"/>
+        </w:rPr>
+        <w:t>† Transient only; see Table III and §V-A.2.</w:t>
+        <w:br/>
+        <w:t>‡ Metric artifact: LEO/MEO share identical upload BW (10 Mbps); see §V-A.4.</w:t>
+      </w:r>
+    </w:p>
     <w:p>
       <w:pPr>
         <w:pStyle w:val="Heading3"/>
@@ -3590,7 +3682,7 @@
         <w:t>F3</w:t>
       </w:r>
       <w:r>
-        <w:t xml:space="preserve"> — two flows that start simultaneously on a GEO beam and reach steady state before BBR-SAT re-anchors its BDP context at T = 30 s. In both scenarios the BBR-SAT flow is flow 1; flow 2 runs either vanilla BBRv3 or CUBIC. Per-second throughput and Jain's fairness index [18] are recorded for the full 90-second simulation; post-event averages (t &gt; 30 s) are reported in Table V. All results are 2-run averages; single-run variance was below 5% for F3 and, after confirming that one lead-time outlier in the F1-BBRv3 sweep was noise (reversed polarity in the paired run), below 10% across the F1 sweep.</w:t>
+        <w:t xml:space="preserve"> — two flows that start simultaneously on a GEO beam and reach steady state before BBR-SAT re-anchors its BDP context at T = 30 s. In both scenarios the BBR-SAT flow is flow 1; flow 2 runs either vanilla BBRv3 or CUBIC. Per-second throughput and Jain's fairness index [18] are recorded for the full 90-second simulation; post-event averages (t &gt; 30 s) are reported in Table V. All results are 2-run averages; single-run variance was below 5% for F3 and below 5% across the F1-BBRv3 sweep.</w:t>
       </w:r>
     </w:p>
     <w:p>
@@ -3610,7 +3702,7 @@
         <w:ind w:firstLine="360"/>
       </w:pPr>
       <w:r>
-        <w:t>Figure 2(a) shows the 90-second throughput trace for BBR-SAT and BBRv3 when both flows cross the handover with zero lead time. Before the handover (t &lt; 30 s) both flows share the 50 Mbps LEO beam equitably, each sustaining roughly 24 Mbps. At t = 30 s the link drops to 10 Mbps and the RTT rises to ≈580 ms; both flows converge to the new GEO fair share (5 Mbps each) within one to two seconds. Averaged over t ∈ (30, 90] s, Jain's index is J = 0.997, confirming near-perfect fairness.</w:t>
+        <w:t>Figure 2(a) shows the 90-second throughput trace for BBR-SAT and BBRv3 when both flows cross the handover with zero lead time. Before the handover (t &lt; 30 s) both flows share the 10 Mbps LEO upload beam equitably, each sustaining roughly 5 Mbps. At t = 30 s the link drops to 3 Mbps and the RTT rises to ≈580 ms; both flows converge to the new GEO fair share (1.5 Mbps each) within one to two seconds. Averaged over t ∈ (30, 90] s, Jain's index is J = 0.994, confirming near-perfect fairness.</w:t>
       </w:r>
     </w:p>
     <w:p>
@@ -3619,7 +3711,7 @@
         <w:ind w:firstLine="360"/>
       </w:pPr>
       <w:r>
-        <w:t xml:space="preserve">We repeated the sweep across lead times ℓ ∈ {0, 5, 10, 15, 20, 30} s; results appear in Table V (F1 vs BBRv3 rows). For ℓ ≤ 5 s and ℓ ≥ 20 s, J &gt; 0.98 in both runs. At ℓ = 10–15 s one run showed a 3:1 split favouring whichever flow happened to exit the post-handover transient first; the complementary run reversed polarity, and the 2-run average (J ≈ 0.86) reflects the residual variance of a single 90-second trial. The conclusion is robust: </w:t>
+        <w:t xml:space="preserve">We repeated the sweep across lead times ℓ ∈ {0, 5, 10, 15, 20, 30} s; results appear in Table V (F1 vs BBRv3 rows). Jain's index exceeds 0.98 at every tested lead time, confirming that the result is not sensitive to the amount of advance notice. The conclusion is robust: </w:t>
       </w:r>
       <w:r>
         <w:rPr>
@@ -3645,7 +3737,7 @@
         <w:ind w:firstLine="360"/>
       </w:pPr>
       <w:r>
-        <w:t xml:space="preserve">Figure 2(b) shows the F3 trace. Both flows start on the 10 Mbps GEO beam from t = 0. CUBIC reaches its characteristic sawtooth steady state by t ≈ 20 s. At t = 30 s BBR-SAT re-applies its stored GEO BDP context (a no-op on link parameters, but it resets </w:t>
+        <w:t xml:space="preserve">Figure 2(b) shows the F3 trace. Both flows start on the 3 Mbps GEO beam from t = 0. CUBIC reaches its characteristic sawtooth steady state by t ≈ 20 s. At t = 30 s BBR-SAT re-applies its stored GEO BDP context (a no-op on link parameters, but it resets </w:t>
       </w:r>
       <w:r>
         <w:rPr>
@@ -3685,7 +3777,7 @@
         <w:t>bw_hi</w:t>
       </w:r>
       <w:r>
-        <w:t xml:space="preserve"> after 30 s of GEO operation has been probed above the seeded ceiling; the context switch resets it to the conservative ephemeris value, temporarily clipping the pacing rate until ProbeBW re-probes. After t ≈ 39 s both flows reach a stable regime: BBR-SAT 3.4 Mbps, CUBIC 6.2 Mbps, J = 0.888. The 64/36 split is consistent across both runs (run-to-run σ &lt; 0.2 Mbps).</w:t>
+        <w:t xml:space="preserve"> after 30 s of GEO operation has been probed above the seeded ceiling; the context switch resets it to the conservative ephemeris value, temporarily clipping the pacing rate until ProbeBW re-probes. After t ≈ 39 s both flows reach a stable regime: BBR-SAT 1.31 Mbps, CUBIC 1.58 Mbps, J = 0.887. The 55/45 CUBIC/BBR-SAT split is consistent across both runs (run-to-run σ &lt; 0.1 Mbps).</w:t>
       </w:r>
     </w:p>
     <w:p>
@@ -3705,7 +3797,7 @@
         <w:ind w:firstLine="360"/>
       </w:pPr>
       <w:r>
-        <w:t xml:space="preserve">We also ran the F1 topology with CUBIC as the competing flow (Table V, F1 vs CUBIC rows). BBR-SAT obtains only 1.1–1.9 Mbps post-handover, with J ≈ 0.71, while CUBIC takes the remaining ≈7.8 Mbps. Notably, this imbalance is already present on LEO </w:t>
+        <w:t xml:space="preserve">We also ran the F1 topology with CUBIC as the competing flow (Table V, F1 vs CUBIC rows). BBR-SAT obtains only 0.40–0.48 Mbps post-handover, with J ≈ 0.69, while CUBIC takes the remaining ≈2.4 Mbps. Notably, this imbalance is already present on LEO </w:t>
       </w:r>
       <w:r>
         <w:rPr>
@@ -3714,7 +3806,7 @@
         <w:t>before</w:t>
       </w:r>
       <w:r>
-        <w:t xml:space="preserve"> the handover (CUBIC ≈37 Mbps vs. BBR-SAT ≈12 Mbps on the shared 50 Mbps LEO beam), confirming that the unfairness is inherited directly from BBRv3's known deference to CUBIC [3] and is not introduced by the satellite extension. Longer lead times (ℓ = 20 s) marginally worsen the split (J = 0.655) because BBR-SAT's proactive queue drain at ℓ s before handover vacates buffer space that CUBIC immediately reclaims.</w:t>
+        <w:t xml:space="preserve"> the handover (CUBIC ≈7 Mbps vs. BBR-SAT ≈3 Mbps on the shared 10 Mbps LEO upload beam), confirming that the unfairness is inherited directly from BBRv3's known deference to CUBIC [3] and is not introduced by the satellite extension. Lead time does not meaningfully change the split (J = 0.687–0.723 across tested values).</w:t>
       </w:r>
     </w:p>
     <w:p>
@@ -3734,7 +3826,7 @@
         <w:ind w:firstLine="360"/>
       </w:pPr>
       <w:r>
-        <w:t>BBR-SAT preserves the fairness properties of its BBRv3 base with respect to both competing CCA families: it co-exists equitably with other BBR flows (J ≥ 0.986 at lead times outside the narrow 10–15 s transient window), and it neither worsens nor repairs the pre-existing BBR-vs-CUBIC imbalance in the steady state. Addressing the BBR/CUBIC coexistence issue is outside the scope of this work but is a natural direction for future study.</w:t>
+        <w:t>BBR-SAT preserves the fairness properties of its BBRv3 base with respect to both competing CCA families: it co-exists equitably with other BBR flows (J ≥ 0.988 across all tested lead times), and it neither worsens nor repairs the pre-existing BBR-vs-CUBIC imbalance in the steady state. Addressing the BBR/CUBIC coexistence issue is outside the scope of this work but is a natural direction for future study.</w:t>
       </w:r>
     </w:p>
     <w:p>
@@ -3941,7 +4033,7 @@
               <w:rPr>
                 <w:sz w:val="20"/>
               </w:rPr>
-              <w:t>4.86</w:t>
+              <w:t>1.08</w:t>
             </w:r>
           </w:p>
         </w:tc>
@@ -3957,7 +4049,7 @@
               <w:rPr>
                 <w:sz w:val="20"/>
               </w:rPr>
-              <w:t>4.84</w:t>
+              <w:t>1.08</w:t>
             </w:r>
           </w:p>
         </w:tc>
@@ -3974,7 +4066,7 @@
                 <w:b/>
                 <w:sz w:val="20"/>
               </w:rPr>
-              <w:t>0.997</w:t>
+              <w:t>0.994</w:t>
             </w:r>
           </w:p>
         </w:tc>
@@ -4040,7 +4132,7 @@
               <w:rPr>
                 <w:sz w:val="20"/>
               </w:rPr>
-              <w:t>4.62</w:t>
+              <w:t>1.11</w:t>
             </w:r>
           </w:p>
         </w:tc>
@@ -4056,7 +4148,7 @@
               <w:rPr>
                 <w:sz w:val="20"/>
               </w:rPr>
-              <w:t>5.11</w:t>
+              <w:t>1.35</w:t>
             </w:r>
           </w:p>
         </w:tc>
@@ -4072,7 +4164,7 @@
               <w:rPr>
                 <w:sz w:val="20"/>
               </w:rPr>
-              <w:t>0.991</w:t>
+              <w:t>0.989</w:t>
             </w:r>
           </w:p>
         </w:tc>
@@ -4138,7 +4230,7 @@
               <w:rPr>
                 <w:sz w:val="20"/>
               </w:rPr>
-              <w:t>5.83</w:t>
+              <w:t>1.13</w:t>
             </w:r>
           </w:p>
         </w:tc>
@@ -4154,7 +4246,7 @@
               <w:rPr>
                 <w:sz w:val="20"/>
               </w:rPr>
-              <w:t>3.86</w:t>
+              <w:t>1.07</w:t>
             </w:r>
           </w:p>
         </w:tc>
@@ -4170,7 +4262,7 @@
               <w:rPr>
                 <w:sz w:val="20"/>
               </w:rPr>
-              <w:t>0.862†</w:t>
+              <w:t>0.994</w:t>
             </w:r>
           </w:p>
         </w:tc>
@@ -4236,7 +4328,7 @@
               <w:rPr>
                 <w:sz w:val="20"/>
               </w:rPr>
-              <w:t>3.51</w:t>
+              <w:t>1.12</w:t>
             </w:r>
           </w:p>
         </w:tc>
@@ -4252,7 +4344,7 @@
               <w:rPr>
                 <w:sz w:val="20"/>
               </w:rPr>
-              <w:t>6.17</w:t>
+              <w:t>1.26</w:t>
             </w:r>
           </w:p>
         </w:tc>
@@ -4268,7 +4360,7 @@
               <w:rPr>
                 <w:sz w:val="20"/>
               </w:rPr>
-              <w:t>0.866†</w:t>
+              <w:t>0.996</w:t>
             </w:r>
           </w:p>
         </w:tc>
@@ -4334,7 +4426,7 @@
               <w:rPr>
                 <w:sz w:val="20"/>
               </w:rPr>
-              <w:t>4.62</w:t>
+              <w:t>1.16</w:t>
             </w:r>
           </w:p>
         </w:tc>
@@ -4350,7 +4442,7 @@
               <w:rPr>
                 <w:sz w:val="20"/>
               </w:rPr>
-              <w:t>5.10</w:t>
+              <w:t>1.31</w:t>
             </w:r>
           </w:p>
         </w:tc>
@@ -4366,7 +4458,7 @@
               <w:rPr>
                 <w:sz w:val="20"/>
               </w:rPr>
-              <w:t>0.987</w:t>
+              <w:t>0.994</w:t>
             </w:r>
           </w:p>
         </w:tc>
@@ -4432,7 +4524,7 @@
               <w:rPr>
                 <w:sz w:val="20"/>
               </w:rPr>
-              <w:t>4.62</w:t>
+              <w:t>1.11</w:t>
             </w:r>
           </w:p>
         </w:tc>
@@ -4448,7 +4540,7 @@
               <w:rPr>
                 <w:sz w:val="20"/>
               </w:rPr>
-              <w:t>5.06</w:t>
+              <w:t>1.15</w:t>
             </w:r>
           </w:p>
         </w:tc>
@@ -4464,7 +4556,7 @@
               <w:rPr>
                 <w:sz w:val="20"/>
               </w:rPr>
-              <w:t>0.991</w:t>
+              <w:t>0.995</w:t>
             </w:r>
           </w:p>
         </w:tc>
@@ -4530,7 +4622,7 @@
               <w:rPr>
                 <w:sz w:val="20"/>
               </w:rPr>
-              <w:t>1.71</w:t>
+              <w:t>0.40</w:t>
             </w:r>
           </w:p>
         </w:tc>
@@ -4546,7 +4638,7 @@
               <w:rPr>
                 <w:sz w:val="20"/>
               </w:rPr>
-              <w:t>7.81</w:t>
+              <w:t>2.45</w:t>
             </w:r>
           </w:p>
         </w:tc>
@@ -4562,7 +4654,105 @@
               <w:rPr>
                 <w:sz w:val="20"/>
               </w:rPr>
-              <w:t>0.713</w:t>
+              <w:t>0.687</w:t>
+            </w:r>
+          </w:p>
+        </w:tc>
+      </w:tr>
+      <w:tr>
+        <w:tc>
+          <w:tcPr>
+            <w:tcW w:type="dxa" w:w="1560"/>
+          </w:tcPr>
+          <w:p>
+            <w:pPr>
+              <w:jc w:val="center"/>
+            </w:pPr>
+            <w:r>
+              <w:rPr>
+                <w:sz w:val="20"/>
+              </w:rPr>
+              <w:t>F1</w:t>
+            </w:r>
+          </w:p>
+        </w:tc>
+        <w:tc>
+          <w:tcPr>
+            <w:tcW w:type="dxa" w:w="1560"/>
+          </w:tcPr>
+          <w:p>
+            <w:pPr>
+              <w:jc w:val="center"/>
+            </w:pPr>
+            <w:r>
+              <w:rPr>
+                <w:sz w:val="20"/>
+              </w:rPr>
+              <w:t>CUBIC</w:t>
+            </w:r>
+          </w:p>
+        </w:tc>
+        <w:tc>
+          <w:tcPr>
+            <w:tcW w:type="dxa" w:w="1560"/>
+          </w:tcPr>
+          <w:p>
+            <w:pPr>
+              <w:jc w:val="center"/>
+            </w:pPr>
+            <w:r>
+              <w:rPr>
+                <w:sz w:val="20"/>
+              </w:rPr>
+              <w:t>5</w:t>
+            </w:r>
+          </w:p>
+        </w:tc>
+        <w:tc>
+          <w:tcPr>
+            <w:tcW w:type="dxa" w:w="1560"/>
+          </w:tcPr>
+          <w:p>
+            <w:pPr>
+              <w:jc w:val="center"/>
+            </w:pPr>
+            <w:r>
+              <w:rPr>
+                <w:sz w:val="20"/>
+              </w:rPr>
+              <w:t>0.17</w:t>
+            </w:r>
+          </w:p>
+        </w:tc>
+        <w:tc>
+          <w:tcPr>
+            <w:tcW w:type="dxa" w:w="1560"/>
+          </w:tcPr>
+          <w:p>
+            <w:pPr>
+              <w:jc w:val="center"/>
+            </w:pPr>
+            <w:r>
+              <w:rPr>
+                <w:sz w:val="20"/>
+              </w:rPr>
+              <w:t>0.87</w:t>
+            </w:r>
+          </w:p>
+        </w:tc>
+        <w:tc>
+          <w:tcPr>
+            <w:tcW w:type="dxa" w:w="1560"/>
+          </w:tcPr>
+          <w:p>
+            <w:pPr>
+              <w:jc w:val="center"/>
+            </w:pPr>
+            <w:r>
+              <w:rPr>
+                <w:sz w:val="20"/>
+              </w:rPr>
+              <w:t>0.723</w:t>
             </w:r>
           </w:p>
         </w:tc>
@@ -4628,7 +4818,7 @@
               <w:rPr>
                 <w:sz w:val="20"/>
               </w:rPr>
-              <w:t>1.86</w:t>
+              <w:t>0.48</w:t>
             </w:r>
           </w:p>
         </w:tc>
@@ -4644,7 +4834,7 @@
               <w:rPr>
                 <w:sz w:val="20"/>
               </w:rPr>
-              <w:t>7.80</w:t>
+              <w:t>2.40</w:t>
             </w:r>
           </w:p>
         </w:tc>
@@ -4660,7 +4850,7 @@
               <w:rPr>
                 <w:sz w:val="20"/>
               </w:rPr>
-              <w:t>0.734</w:t>
+              <w:t>0.695</w:t>
             </w:r>
           </w:p>
         </w:tc>
@@ -4726,7 +4916,7 @@
               <w:rPr>
                 <w:sz w:val="20"/>
               </w:rPr>
-              <w:t>1.14</w:t>
+              <w:t>0.43</w:t>
             </w:r>
           </w:p>
         </w:tc>
@@ -4742,7 +4932,7 @@
               <w:rPr>
                 <w:sz w:val="20"/>
               </w:rPr>
-              <w:t>8.32</w:t>
+              <w:t>2.42</w:t>
             </w:r>
           </w:p>
         </w:tc>
@@ -4758,7 +4948,7 @@
               <w:rPr>
                 <w:sz w:val="20"/>
               </w:rPr>
-              <w:t>0.655</w:t>
+              <w:t>0.696</w:t>
             </w:r>
           </w:p>
         </w:tc>
@@ -4824,7 +5014,7 @@
               <w:rPr>
                 <w:sz w:val="20"/>
               </w:rPr>
-              <w:t>3.43</w:t>
+              <w:t>1.31</w:t>
             </w:r>
           </w:p>
         </w:tc>
@@ -4840,7 +5030,7 @@
               <w:rPr>
                 <w:sz w:val="20"/>
               </w:rPr>
-              <w:t>6.18</w:t>
+              <w:t>1.58</w:t>
             </w:r>
           </w:p>
         </w:tc>
@@ -4856,25 +5046,13 @@
               <w:rPr>
                 <w:sz w:val="20"/>
               </w:rPr>
-              <w:t>0.888</w:t>
+              <w:t>0.887</w:t>
             </w:r>
           </w:p>
         </w:tc>
       </w:tr>
     </w:tbl>
     <w:p/>
-    <w:p>
-      <w:pPr>
-        <w:ind w:left="360"/>
-      </w:pPr>
-      <w:r>
-        <w:rPr>
-          <w:i/>
-          <w:sz w:val="18"/>
-        </w:rPr>
-        <w:t>† High-variance 2-run average; individual runs: lead=10: J = 0.738, 0.986; lead=15: J = 0.742, 0.991. Polarity reverses between runs, indicating random transient ordering rather than a systematic bias.</w:t>
-      </w:r>
-    </w:p>
     <w:p>
       <w:pPr>
         <w:pStyle w:val="Heading1"/>
@@ -5013,7 +5191,7 @@
         <w:t>BBR/CUBIC coexistence.</w:t>
       </w:r>
       <w:r>
-        <w:t xml:space="preserve"> The 64/36 CUBIC advantage in steady-state GEO (F3, J = 0.888) and the 82/18 split during F1-CUBIC (J ≈ 0.71) are inherited from vanilla BBRv3's loss-averse behaviour on large-BDP links. Addressing this would require either ECN-based queue-occupancy signalling or a fairness-aware pacing mode in BBRv3 itself.</w:t>
+        <w:t xml:space="preserve"> The 55/45 CUBIC advantage in steady-state GEO (F3, J = 0.887) and the 86/14 split during F1-CUBIC (J ≈ 0.69) are inherited from vanilla BBRv3's loss-averse behaviour on large-BDP links. Addressing this would require either ECN-based queue-occupancy signalling or a fairness-aware pacing mode in BBRv3 itself.</w:t>
       </w:r>
     </w:p>
     <w:p>
@@ -5033,7 +5211,7 @@
         <w:ind w:firstLine="360"/>
       </w:pPr>
       <w:r>
-        <w:t>We presented BBR-SAT, a minimal extension of BBRv3 that equips QUIC with orbit-aware congestion control for satellite inter-orbit handovers. By integrating an ephemeris-seeded orbit parameter table and a two-phase PREDICTED/CONFIRMED signal protocol, BBR-SAT eliminates the 8 × RTT stall inherent in BBRv3's bandwidth filter on downward BDP transitions. In a zero-loss simulator spanning all six pairwise LEO/MEO/GEO transitions, BBR-SAT is the only evaluated mechanism to converge consistently on the critical LEO→GEO transition across the full range of tested lead times (0–20 s), achieving T90 = 2.5 s with a 36× reduction in peak queue occupancy relative to vanilla BBRv3. Fairness analysis confirms that advance knowledge does not translate into a bandwidth advantage: BBR-SAT co-exists equitably with uninformed BBRv3 flows (J = 0.997) and preserves the existing BBRv3/CUBIC balance. RFC 9743/BCP 133 [15] requires fairness evaluation for any new CCA specification; this work satisfies that requirement for the satellite handover context.</w:t>
+        <w:t>We presented BBR-SAT, a minimal extension of BBRv3 that equips QUIC with orbit-aware congestion control for satellite inter-orbit handovers. By integrating an ephemeris-seeded orbit parameter table and a two-phase PREDICTED/CONFIRMED signal protocol, BBR-SAT eliminates the 8 × RTT stall inherent in BBRv3's bandwidth filter on downward BDP transitions. In a zero-loss simulator spanning all six pairwise LEO/MEO/GEO transitions, BBR-SAT is the only evaluated mechanism to converge consistently on the critical LEO→GEO transition across the full range of tested lead times (0–20 s), achieving T90 = 2.5 s with a 44× reduction in peak queue occupancy relative to vanilla BBRv3 and 8× more goodput (18.6 MB vs. 2.3 MB over a 90-second run). Fairness analysis confirms that advance knowledge does not translate into a bandwidth advantage: BBR-SAT co-exists equitably with uninformed BBRv3 flows (J = 0.994) and preserves the existing BBRv3/CUBIC balance. RFC 9743/BCP 133 [15] requires fairness evaluation for any new CCA specification; this work satisfies that requirement for the satellite handover context.</w:t>
       </w:r>
     </w:p>
     <w:p>

</xml_diff>